<commit_message>
docs: added for review 1
</commit_message>
<xml_diff>
--- a/Docs/T076-CS23721-Project-Phase-I/Report/CS23721-Project-Phase-I-T076-First-Review-Report.docx
+++ b/Docs/T076-CS23721-Project-Phase-I/Report/CS23721-Project-Phase-I-T076-First-Review-Report.docx
@@ -662,8 +662,10 @@
                 <w:bCs/>
                 <w:color w:val="000000"/>
               </w:rPr>
-              <w:t xml:space="preserve"> 3</w:t>
-            </w:r>
+              <w:t xml:space="preserve"> 2</w:t>
+            </w:r>
+            <w:bookmarkStart w:id="0" w:name="_GoBack"/>
+            <w:bookmarkEnd w:id="0"/>
           </w:p>
         </w:tc>
       </w:tr>
@@ -1339,30 +1341,7 @@
                 <w:sz w:val="24"/>
                 <w:szCs w:val="24"/>
               </w:rPr>
-              <w:t xml:space="preserve">Development of a voice-based AI receptionist system capable of handling college telephone inquiries using speech recognition, Retrieval-Augmented Generation (RAG), Large Language Models, and text-to-speech, providing accurate and context-grounded responses from institutional knowledge, supporting authenticated student information retrieval through </w:t>
-            </w:r>
-            <w:proofErr w:type="spellStart"/>
-            <w:r>
-              <w:rPr>
-                <w:sz w:val="24"/>
-                <w:szCs w:val="24"/>
-              </w:rPr>
-              <w:t>DigiCampus</w:t>
-            </w:r>
-            <w:proofErr w:type="spellEnd"/>
-            <w:r>
-              <w:rPr>
-                <w:sz w:val="24"/>
-                <w:szCs w:val="24"/>
-              </w:rPr>
-              <w:t xml:space="preserve"> integration, and intelligently escalating complex or unresolved que</w:t>
-            </w:r>
-            <w:r>
-              <w:rPr>
-                <w:sz w:val="24"/>
-                <w:szCs w:val="24"/>
-              </w:rPr>
-              <w:t>ries to human reception staff.</w:t>
+              <w:t>Development of a voice-based AI receptionist system capable of handling college telephone inquiries using speech recognition, Retrieval-Augmented Generation (RAG), Large Language Models, and text-to-speech, providing accurate and context-grounded responses from institutional knowledge through real-time voice interaction.</w:t>
             </w:r>
           </w:p>
         </w:tc>
@@ -1628,8 +1607,6 @@
         </w:rPr>
         <w:t xml:space="preserve">     </w:t>
       </w:r>
-      <w:bookmarkStart w:id="0" w:name="_GoBack"/>
-      <w:bookmarkEnd w:id="0"/>
       <w:r>
         <w:rPr>
           <w:b/>
@@ -2211,6 +2188,7 @@
   <w:style w:type="character" w:default="1" w:styleId="DefaultParagraphFont">
     <w:name w:val="Default Paragraph Font"/>
     <w:uiPriority w:val="1"/>
+    <w:semiHidden/>
     <w:unhideWhenUsed/>
   </w:style>
   <w:style w:type="table" w:default="1" w:styleId="TableNormal">
@@ -2324,6 +2302,33 @@
         <w:insideV w:val="single" w:sz="4" w:space="0" w:color="auto"/>
       </w:tblBorders>
     </w:tblPr>
+  </w:style>
+  <w:style w:type="paragraph" w:styleId="BalloonText">
+    <w:name w:val="Balloon Text"/>
+    <w:basedOn w:val="Normal"/>
+    <w:link w:val="BalloonTextChar"/>
+    <w:uiPriority w:val="99"/>
+    <w:semiHidden/>
+    <w:unhideWhenUsed/>
+    <w:rsid w:val="009D067C"/>
+    <w:rPr>
+      <w:rFonts w:ascii="Segoe UI" w:hAnsi="Segoe UI" w:cs="Segoe UI"/>
+      <w:sz w:val="18"/>
+      <w:szCs w:val="18"/>
+    </w:rPr>
+  </w:style>
+  <w:style w:type="character" w:customStyle="1" w:styleId="BalloonTextChar">
+    <w:name w:val="Balloon Text Char"/>
+    <w:basedOn w:val="DefaultParagraphFont"/>
+    <w:link w:val="BalloonText"/>
+    <w:uiPriority w:val="99"/>
+    <w:semiHidden/>
+    <w:rsid w:val="009D067C"/>
+    <w:rPr>
+      <w:rFonts w:ascii="Segoe UI" w:hAnsi="Segoe UI" w:cs="Segoe UI"/>
+      <w:sz w:val="18"/>
+      <w:szCs w:val="18"/>
+    </w:rPr>
   </w:style>
 </w:styles>
 </file>

</xml_diff>